<commit_message>
Swap the order of points 1 and 2 across manifesto and booth kit
Claim 2 meters now leads, grow the code follows. Wording and phrasing
unchanged; only the sequence markers move with position. Applied to the
manifesto (Markdown, letterhead PDF, Word) and the booth card, table
sign, and poster.
</commit_message>
<xml_diff>
--- a/manifesto/BKG_Manifesto_Letterhead.docx
+++ b/manifesto/BKG_Manifesto_Letterhead.docx
@@ -270,7 +270,7 @@
           <w:sz w:val="21"/>
           <w:szCs w:val="21"/>
         </w:rPr>
-        <w:t xml:space="preserve">First, we grow the code. </w:t>
+        <w:t xml:space="preserve">First, we claim the 2 meter band, and we do it in code. </w:t>
       </w:r>
       <w:r>
         <w:rPr>
@@ -279,7 +279,7 @@
           <w:sz w:val="21"/>
           <w:szCs w:val="21"/>
         </w:rPr>
-        <w:t xml:space="preserve">Morse is not a relic gathering dust in the history of the hobby. It is the real thing, alive in the hands of anyone willing to learn it, and we intend to keep it that way. Our purpose is to swell the ranks of operators who can send and copy CW with confidence. We lower the barrier for the curious, we sit with the beginner who is still counting dits, and we prove night after night that a steady fist and a patient ear will outperform the most expensive rig on the market. Every operator we bring to the key is a victory for the entire hobby, not just for us.</w:t>
+        <w:t xml:space="preserve">144 MHz is our home, and far too much of it sits silent while the world talks past it on other bands. We exist to put activity back on those frequencies, and above everything else we champion CW on 2 meters, a mode so overlooked that most operators no longer believe it is there at all. When Morse on VHF becomes an ordinary thing to hear again, we reopen a door that has been closed for the better part of a generation. That door leads somewhere worth going, and we intend to hold it open for everyone who follows.</w:t>
       </w:r>
     </w:p>
     <w:p>
@@ -297,7 +297,7 @@
           <w:sz w:val="21"/>
           <w:szCs w:val="21"/>
         </w:rPr>
-        <w:t xml:space="preserve">Second, we claim the 2 meter band, and we do it in code. </w:t>
+        <w:t xml:space="preserve">Second, we grow the code. </w:t>
       </w:r>
       <w:r>
         <w:rPr>
@@ -306,7 +306,7 @@
           <w:sz w:val="21"/>
           <w:szCs w:val="21"/>
         </w:rPr>
-        <w:t xml:space="preserve">144 MHz is our home, and far too much of it sits silent while the world talks past it on other bands. We exist to put activity back on those frequencies, and above everything else we champion CW on 2 meters, a mode so overlooked that most operators no longer believe it is there at all. When Morse on VHF becomes an ordinary thing to hear again, we reopen a door that has been closed for the better part of a generation. That door leads somewhere worth going, and we intend to hold it open for everyone who follows.</w:t>
+        <w:t xml:space="preserve">Morse is not a relic gathering dust in the history of the hobby. It is the real thing, alive in the hands of anyone willing to learn it, and we intend to keep it that way. Our purpose is to swell the ranks of operators who can send and copy CW with confidence. We lower the barrier for the curious, we sit with the beginner who is still counting dits, and we prove night after night that a steady fist and a patient ear will outperform the most expensive rig on the market. Every operator we bring to the key is a victory for the entire hobby, not just for us.</w:t>
       </w:r>
     </w:p>
     <w:p>

</xml_diff>